<commit_message>
Corrección de errata en respuestas
</commit_message>
<xml_diff>
--- a/multichoice/build/es_electric_series_parallel_calc.docx
+++ b/multichoice/build/es_electric_series_parallel_calc.docx
@@ -84,7 +84,7 @@
       <w:r>
         <w:t>c)</w:t>
         <w:tab/>
-        <w:t>0V</w:t>
+        <w:t>0,75V</w:t>
       </w:r>
     </w:p>
     <w:p>
@@ -94,7 +94,7 @@
       <w:r>
         <w:t>d)</w:t>
         <w:tab/>
-        <w:t>0,75V</w:t>
+        <w:t>0V</w:t>
       </w:r>
     </w:p>
     <w:p>
@@ -151,7 +151,7 @@
       <w:r>
         <w:t>a)</w:t>
         <w:tab/>
-        <w:t>3Ω</w:t>
+        <w:t>8Ω</w:t>
       </w:r>
     </w:p>
     <w:p>
@@ -160,6 +160,16 @@
       </w:pPr>
       <w:r>
         <w:t>b)</w:t>
+        <w:tab/>
+        <w:t>2Ω</w:t>
+      </w:r>
+    </w:p>
+    <w:p>
+      <w:pPr>
+        <w:pStyle w:val="Choice"/>
+      </w:pPr>
+      <w:r>
+        <w:t>c)</w:t>
         <w:tab/>
         <w:t>4Ω</w:t>
       </w:r>
@@ -169,19 +179,9 @@
         <w:pStyle w:val="Choice"/>
       </w:pPr>
       <w:r>
-        <w:t>c)</w:t>
-        <w:tab/>
-        <w:t>8Ω</w:t>
-      </w:r>
-    </w:p>
-    <w:p>
-      <w:pPr>
-        <w:pStyle w:val="Choice"/>
-      </w:pPr>
-      <w:r>
         <w:t>d)</w:t>
         <w:tab/>
-        <w:t>2Ω</w:t>
+        <w:t>3Ω</w:t>
       </w:r>
     </w:p>
     <w:p>
@@ -238,7 +238,7 @@
       <w:r>
         <w:t>a)</w:t>
         <w:tab/>
-        <w:t>2V</w:t>
+        <w:t>2/3V</w:t>
       </w:r>
     </w:p>
     <w:p>
@@ -248,7 +248,7 @@
       <w:r>
         <w:t>b)</w:t>
         <w:tab/>
-        <w:t>8V</w:t>
+        <w:t>2V</w:t>
       </w:r>
     </w:p>
     <w:p>
@@ -268,7 +268,7 @@
       <w:r>
         <w:t>d)</w:t>
         <w:tab/>
-        <w:t>2/3V</w:t>
+        <w:t>8V</w:t>
       </w:r>
     </w:p>
     <w:p>
@@ -325,7 +325,7 @@
       <w:r>
         <w:t>a)</w:t>
         <w:tab/>
-        <w:t>6V</w:t>
+        <w:t>8V</w:t>
       </w:r>
     </w:p>
     <w:p>
@@ -335,7 +335,7 @@
       <w:r>
         <w:t>b)</w:t>
         <w:tab/>
-        <w:t>8V</w:t>
+        <w:t>2/3V</w:t>
       </w:r>
     </w:p>
     <w:p>
@@ -355,7 +355,7 @@
       <w:r>
         <w:t>d)</w:t>
         <w:tab/>
-        <w:t>2/3V</w:t>
+        <w:t>6V</w:t>
       </w:r>
     </w:p>
     <w:p>
@@ -412,6 +412,16 @@
       <w:r>
         <w:t>a)</w:t>
         <w:tab/>
+        <w:t>7Ω</w:t>
+      </w:r>
+    </w:p>
+    <w:p>
+      <w:pPr>
+        <w:pStyle w:val="Choice"/>
+      </w:pPr>
+      <w:r>
+        <w:t>b)</w:t>
+        <w:tab/>
         <w:t>12Ω</w:t>
       </w:r>
     </w:p>
@@ -420,9 +430,9 @@
         <w:pStyle w:val="Choice"/>
       </w:pPr>
       <w:r>
-        <w:t>b)</w:t>
+        <w:t>c)</w:t>
         <w:tab/>
-        <w:t>7Ω</w:t>
+        <w:t>8/6Ω</w:t>
       </w:r>
     </w:p>
     <w:p>
@@ -430,19 +440,9 @@
         <w:pStyle w:val="Choice"/>
       </w:pPr>
       <w:r>
-        <w:t>c)</w:t>
+        <w:t>d)</w:t>
         <w:tab/>
         <w:t>6/8Ω</w:t>
-      </w:r>
-    </w:p>
-    <w:p>
-      <w:pPr>
-        <w:pStyle w:val="Choice"/>
-      </w:pPr>
-      <w:r>
-        <w:t>d)</w:t>
-        <w:tab/>
-        <w:t>8/6Ω</w:t>
       </w:r>
     </w:p>
     <w:p>
@@ -509,7 +509,7 @@
       <w:r>
         <w:t>b)</w:t>
         <w:tab/>
-        <w:t>0,5Ω</w:t>
+        <w:t>3/6Ω</w:t>
       </w:r>
     </w:p>
     <w:p>
@@ -519,7 +519,7 @@
       <w:r>
         <w:t>c)</w:t>
         <w:tab/>
-        <w:t>3/6Ω</w:t>
+        <w:t>0,5Ω</w:t>
       </w:r>
     </w:p>
     <w:p>
@@ -586,6 +586,16 @@
       <w:r>
         <w:t>a)</w:t>
         <w:tab/>
+        <w:t>3/8Ω</w:t>
+      </w:r>
+    </w:p>
+    <w:p>
+      <w:pPr>
+        <w:pStyle w:val="Choice"/>
+      </w:pPr>
+      <w:r>
+        <w:t>b)</w:t>
+        <w:tab/>
         <w:t>4/5Ω</w:t>
       </w:r>
     </w:p>
@@ -594,7 +604,7 @@
         <w:pStyle w:val="Choice"/>
       </w:pPr>
       <w:r>
-        <w:t>b)</w:t>
+        <w:t>c)</w:t>
         <w:tab/>
         <w:t>8/3Ω</w:t>
       </w:r>
@@ -604,19 +614,9 @@
         <w:pStyle w:val="Choice"/>
       </w:pPr>
       <w:r>
-        <w:t>c)</w:t>
+        <w:t>d)</w:t>
         <w:tab/>
         <w:t>5/4Ω</w:t>
-      </w:r>
-    </w:p>
-    <w:p>
-      <w:pPr>
-        <w:pStyle w:val="Choice"/>
-      </w:pPr>
-      <w:r>
-        <w:t>d)</w:t>
-        <w:tab/>
-        <w:t>3/8Ω</w:t>
       </w:r>
     </w:p>
     <w:p>
@@ -673,7 +673,7 @@
       <w:r>
         <w:t>a)</w:t>
         <w:tab/>
-        <w:t>9Ω</w:t>
+        <w:t>3Ω</w:t>
       </w:r>
     </w:p>
     <w:p>
@@ -693,7 +693,7 @@
       <w:r>
         <w:t>c)</w:t>
         <w:tab/>
-        <w:t>3Ω</w:t>
+        <w:t>9Ω</w:t>
       </w:r>
     </w:p>
     <w:p>
@@ -760,7 +760,7 @@
       <w:r>
         <w:t>a)</w:t>
         <w:tab/>
-        <w:t>8Ω</w:t>
+        <w:t>5Ω</w:t>
       </w:r>
     </w:p>
     <w:p>
@@ -780,7 +780,7 @@
       <w:r>
         <w:t>c)</w:t>
         <w:tab/>
-        <w:t>5Ω</w:t>
+        <w:t>6Ω</w:t>
       </w:r>
     </w:p>
     <w:p>
@@ -790,7 +790,7 @@
       <w:r>
         <w:t>d)</w:t>
         <w:tab/>
-        <w:t>6Ω</w:t>
+        <w:t>8Ω</w:t>
       </w:r>
     </w:p>
     <w:p>
@@ -847,7 +847,7 @@
       <w:r>
         <w:t>a)</w:t>
         <w:tab/>
-        <w:t>6Ω</w:t>
+        <w:t>4,5Ω</w:t>
       </w:r>
     </w:p>
     <w:p>
@@ -867,7 +867,7 @@
       <w:r>
         <w:t>c)</w:t>
         <w:tab/>
-        <w:t>4,5Ω</w:t>
+        <w:t>6Ω</w:t>
       </w:r>
     </w:p>
     <w:p>
@@ -934,7 +934,7 @@
       <w:r>
         <w:t>a)</w:t>
         <w:tab/>
-        <w:t>20 Ω</w:t>
+        <w:t>10Ω</w:t>
       </w:r>
     </w:p>
     <w:p>
@@ -964,7 +964,7 @@
       <w:r>
         <w:t>d)</w:t>
         <w:tab/>
-        <w:t>5Ω</w:t>
+        <w:t>20 Ω</w:t>
       </w:r>
     </w:p>
     <w:p>
@@ -1031,6 +1031,16 @@
       <w:r>
         <w:t>b)</w:t>
         <w:tab/>
+        <w:t>Si desconecto la resistencia R1 no pasará corriente por el circuito</w:t>
+      </w:r>
+    </w:p>
+    <w:p>
+      <w:pPr>
+        <w:pStyle w:val="Choice"/>
+      </w:pPr>
+      <w:r>
+        <w:t>c)</w:t>
+        <w:tab/>
         <w:t>Por las dos resistencias pasará siempre la misma intensidad</w:t>
       </w:r>
     </w:p>
@@ -1039,19 +1049,9 @@
         <w:pStyle w:val="Choice"/>
       </w:pPr>
       <w:r>
-        <w:t>c)</w:t>
+        <w:t>d)</w:t>
         <w:tab/>
         <w:t>Las dos resistencias están sometidas al mismo voltaje</w:t>
-      </w:r>
-    </w:p>
-    <w:p>
-      <w:pPr>
-        <w:pStyle w:val="Choice"/>
-      </w:pPr>
-      <w:r>
-        <w:t>d)</w:t>
-        <w:tab/>
-        <w:t>Si desconecto la resistencia R1 no pasará corriente por el circuito</w:t>
       </w:r>
     </w:p>
     <w:p>
@@ -1108,16 +1108,6 @@
       <w:r>
         <w:t>a)</w:t>
         <w:tab/>
-        <w:t>Si desconecto la resistencia R1, seguirá pasando corriente por la R2</w:t>
-      </w:r>
-    </w:p>
-    <w:p>
-      <w:pPr>
-        <w:pStyle w:val="Choice"/>
-      </w:pPr>
-      <w:r>
-        <w:t>b)</w:t>
-        <w:tab/>
         <w:t>Las dos resistencias están sometidas al mismo voltaje</w:t>
       </w:r>
     </w:p>
@@ -1126,7 +1116,7 @@
         <w:pStyle w:val="Choice"/>
       </w:pPr>
       <w:r>
-        <w:t>c)</w:t>
+        <w:t>b)</w:t>
         <w:tab/>
         <w:t>La intensidad total del circuito será la suma de la intensidad por R1 y la intensidad por R2</w:t>
       </w:r>
@@ -1136,9 +1126,19 @@
         <w:pStyle w:val="Choice"/>
       </w:pPr>
       <w:r>
+        <w:t>c)</w:t>
+        <w:tab/>
+        <w:t>La intensidad que pasa por las dos resistencias es la misma</w:t>
+      </w:r>
+    </w:p>
+    <w:p>
+      <w:pPr>
+        <w:pStyle w:val="Choice"/>
+      </w:pPr>
+      <w:r>
         <w:t>d)</w:t>
         <w:tab/>
-        <w:t>La intensidad que pasa por las dos resistencias es la misma</w:t>
+        <w:t>Si desconecto la resistencia R1, seguirá pasando corriente por la R2</w:t>
       </w:r>
     </w:p>
     <w:p>
@@ -1195,6 +1195,16 @@
       <w:r>
         <w:t>a)</w:t>
         <w:tab/>
+        <w:t>Por ella pasará la mitad de la intensidad total del circuito</w:t>
+      </w:r>
+    </w:p>
+    <w:p>
+      <w:pPr>
+        <w:pStyle w:val="Choice"/>
+      </w:pPr>
+      <w:r>
+        <w:t>b)</w:t>
+        <w:tab/>
         <w:t>Pasará la misma intensidad que por la resistencia R2</w:t>
       </w:r>
     </w:p>
@@ -1203,9 +1213,9 @@
         <w:pStyle w:val="Choice"/>
       </w:pPr>
       <w:r>
-        <w:t>b)</w:t>
+        <w:t>c)</w:t>
         <w:tab/>
-        <w:t>Pasará la mitad de intensidad que por la resistencia R2</w:t>
+        <w:t>Pasará el doble de intensidad que por la resistencia R2</w:t>
       </w:r>
     </w:p>
     <w:p>
@@ -1213,19 +1223,9 @@
         <w:pStyle w:val="Choice"/>
       </w:pPr>
       <w:r>
-        <w:t>c)</w:t>
-        <w:tab/>
-        <w:t>Por ella pasará la mitad de la intensidad total del circuito</w:t>
-      </w:r>
-    </w:p>
-    <w:p>
-      <w:pPr>
-        <w:pStyle w:val="Choice"/>
-      </w:pPr>
-      <w:r>
         <w:t>d)</w:t>
         <w:tab/>
-        <w:t>Pasará el doble de intensidad que por la resistencia R2</w:t>
+        <w:t>Pasará la mitad de intensidad que por la resistencia R2</w:t>
       </w:r>
     </w:p>
     <w:p>
@@ -1282,16 +1282,6 @@
       <w:r>
         <w:t>a)</w:t>
         <w:tab/>
-        <w:t>Por la R3</w:t>
-      </w:r>
-    </w:p>
-    <w:p>
-      <w:pPr>
-        <w:pStyle w:val="Choice"/>
-      </w:pPr>
-      <w:r>
-        <w:t>b)</w:t>
-        <w:tab/>
         <w:t>Por la R2</w:t>
       </w:r>
     </w:p>
@@ -1300,7 +1290,7 @@
         <w:pStyle w:val="Choice"/>
       </w:pPr>
       <w:r>
-        <w:t>c)</w:t>
+        <w:t>b)</w:t>
         <w:tab/>
         <w:t>Por la R1</w:t>
       </w:r>
@@ -1310,9 +1300,19 @@
         <w:pStyle w:val="Choice"/>
       </w:pPr>
       <w:r>
+        <w:t>c)</w:t>
+        <w:tab/>
+        <w:t>Por todas pasará la misma</w:t>
+      </w:r>
+    </w:p>
+    <w:p>
+      <w:pPr>
+        <w:pStyle w:val="Choice"/>
+      </w:pPr>
+      <w:r>
         <w:t>d)</w:t>
         <w:tab/>
-        <w:t>Por todas pasará la misma</w:t>
+        <w:t>Por la R3</w:t>
       </w:r>
     </w:p>
     <w:p>
@@ -1369,6 +1369,16 @@
       <w:r>
         <w:t>a)</w:t>
         <w:tab/>
+        <w:t>La intensidad total aumentará respecto a cuando había dos resistencias</w:t>
+      </w:r>
+    </w:p>
+    <w:p>
+      <w:pPr>
+        <w:pStyle w:val="Choice"/>
+      </w:pPr>
+      <w:r>
+        <w:t>b)</w:t>
+        <w:tab/>
         <w:t>El voltaje al que están sometidas las resistencias aumentará respecto a cuando había dos</w:t>
       </w:r>
     </w:p>
@@ -1377,9 +1387,9 @@
         <w:pStyle w:val="Choice"/>
       </w:pPr>
       <w:r>
-        <w:t>b)</w:t>
+        <w:t>c)</w:t>
         <w:tab/>
-        <w:t>El voltaje al que están sometidas a las resistencias disminuirá respecto a cuando había dos</w:t>
+        <w:t>La intensidad total disminuirá respecto a cuando había dos resistencias</w:t>
       </w:r>
     </w:p>
     <w:p>
@@ -1387,19 +1397,9 @@
         <w:pStyle w:val="Choice"/>
       </w:pPr>
       <w:r>
-        <w:t>c)</w:t>
-        <w:tab/>
-        <w:t>La intensidad total aumentará respecto a cuando había dos resistencias</w:t>
-      </w:r>
-    </w:p>
-    <w:p>
-      <w:pPr>
-        <w:pStyle w:val="Choice"/>
-      </w:pPr>
-      <w:r>
         <w:t>d)</w:t>
         <w:tab/>
-        <w:t>La intensidad total disminuirá respecto a cuando había dos resistencias</w:t>
+        <w:t>El voltaje al que están sometidas a las resistencias disminuirá respecto a cuando había dos</w:t>
       </w:r>
     </w:p>
     <w:p>
@@ -1456,6 +1456,26 @@
       <w:r>
         <w:t>a)</w:t>
         <w:tab/>
+        <w:t>El voltaje al que está sometida R1 disminuirá</w:t>
+      </w:r>
+    </w:p>
+    <w:p>
+      <w:pPr>
+        <w:pStyle w:val="Choice"/>
+      </w:pPr>
+      <w:r>
+        <w:t>b)</w:t>
+        <w:tab/>
+        <w:t>La intensidad total del circuito aumentará</w:t>
+      </w:r>
+    </w:p>
+    <w:p>
+      <w:pPr>
+        <w:pStyle w:val="Choice"/>
+      </w:pPr>
+      <w:r>
+        <w:t>c)</w:t>
+        <w:tab/>
         <w:t>La intensidad total del circuito no variará</w:t>
       </w:r>
     </w:p>
@@ -1464,29 +1484,9 @@
         <w:pStyle w:val="Choice"/>
       </w:pPr>
       <w:r>
-        <w:t>b)</w:t>
+        <w:t>d)</w:t>
         <w:tab/>
         <w:t>La intensidad total del circuito disminuirá</w:t>
-      </w:r>
-    </w:p>
-    <w:p>
-      <w:pPr>
-        <w:pStyle w:val="Choice"/>
-      </w:pPr>
-      <w:r>
-        <w:t>c)</w:t>
-        <w:tab/>
-        <w:t>El voltaje al que está sometida R1 disminuirá</w:t>
-      </w:r>
-    </w:p>
-    <w:p>
-      <w:pPr>
-        <w:pStyle w:val="Choice"/>
-      </w:pPr>
-      <w:r>
-        <w:t>d)</w:t>
-        <w:tab/>
-        <w:t>La intensidad total del circuito aumentará</w:t>
       </w:r>
     </w:p>
     <w:p>
@@ -1543,6 +1543,16 @@
       <w:r>
         <w:t>a)</w:t>
         <w:tab/>
+        <w:t>Por R2 pasará la misma intensidad que por R1</w:t>
+      </w:r>
+    </w:p>
+    <w:p>
+      <w:pPr>
+        <w:pStyle w:val="Choice"/>
+      </w:pPr>
+      <w:r>
+        <w:t>b)</w:t>
+        <w:tab/>
         <w:t>La resistencia equivalente en el circuito será de 4Ω</w:t>
       </w:r>
     </w:p>
@@ -1551,9 +1561,9 @@
         <w:pStyle w:val="Choice"/>
       </w:pPr>
       <w:r>
-        <w:t>b)</w:t>
+        <w:t>c)</w:t>
         <w:tab/>
-        <w:t>El voltaje de R1 será la mitad que antes</w:t>
+        <w:t>La intensidad total del circuito no variará</w:t>
       </w:r>
     </w:p>
     <w:p>
@@ -1561,19 +1571,9 @@
         <w:pStyle w:val="Choice"/>
       </w:pPr>
       <w:r>
-        <w:t>c)</w:t>
-        <w:tab/>
-        <w:t>Por R2 pasará la misma intensidad que por R1</w:t>
-      </w:r>
-    </w:p>
-    <w:p>
-      <w:pPr>
-        <w:pStyle w:val="Choice"/>
-      </w:pPr>
-      <w:r>
         <w:t>d)</w:t>
         <w:tab/>
-        <w:t>La intensidad total del circuito no variará</w:t>
+        <w:t>El voltaje de R1 será la mitad que antes</w:t>
       </w:r>
     </w:p>
     <w:p>
@@ -1640,7 +1640,7 @@
       <w:r>
         <w:t>b)</w:t>
         <w:tab/>
-        <w:t>La intensidad total disminuirá</w:t>
+        <w:t>El voltaje de R1 será el mismo que el de R2</w:t>
       </w:r>
     </w:p>
     <w:p>
@@ -1660,7 +1660,7 @@
       <w:r>
         <w:t>d)</w:t>
         <w:tab/>
-        <w:t>El voltaje de R1 será el mismo que el de R2</w:t>
+        <w:t>La intensidad total disminuirá</w:t>
       </w:r>
     </w:p>
     <w:sectPr>

</xml_diff>